<commit_message>
feat: integrate OpenAI Codex and Google Antigravity skills, MCP tooling, and AI enablement into master resume and bulletted-standard deliverables
</commit_message>
<xml_diff>
--- a/output/Bulleted_Standard/Ebenezer_Rolston_Bulleted_Standard_Resume.docx
+++ b/output/Bulleted_Standard/Ebenezer_Rolston_Bulleted_Standard_Resume.docx
@@ -217,7 +217,7 @@
           <w:color w:val="17365D"/>
           <w:sz w:val="18"/>
         </w:rPr>
-        <w:t xml:space="preserve">AI Engineering | AI Guardians LLC </w:t>
+        <w:t xml:space="preserve">AI Engineering &amp; Enablement | AI Guardians LLC </w:t>
       </w:r>
       <w:r>
         <w:rPr>
@@ -238,20 +238,46 @@
           <w:color w:val="1F1F1F"/>
           <w:sz w:val="18"/>
         </w:rPr>
-        <w:t xml:space="preserve">• Created AI maturity assessments, multi-year roadmaps, ROI models.</w:t>
-      </w:r>
-    </w:p>
-    <w:p>
-      <w:pPr>
-        <w:spacing w:before="0" w:after="40" w:line="240" w:lineRule="auto"/>
-        <w:ind w:left="360" w:hanging="180"/>
-      </w:pPr>
-      <w:r>
-        <w:rPr>
-          <w:color w:val="1F1F1F"/>
-          <w:sz w:val="18"/>
-        </w:rPr>
-        <w:t xml:space="preserve">• Designed AI transformation toolkit for AI Guardians, use-case prioritization canvases, Agentic NIST AI RMF governance scorecards.</w:t>
+        <w:t xml:space="preserve">• Engineered autonomous multi-agent workflows and custom TOML/markdown agents using OpenAI Codex and Google Antigravity with runtime hooks, Plan Mode trade-off analysis, and automated build–test–fix loops.</w:t>
+      </w:r>
+    </w:p>
+    <w:p>
+      <w:pPr>
+        <w:spacing w:before="0" w:after="20" w:line="240" w:lineRule="auto"/>
+        <w:ind w:left="360" w:hanging="180"/>
+      </w:pPr>
+      <w:r>
+        <w:rPr>
+          <w:color w:val="1F1F1F"/>
+          <w:sz w:val="18"/>
+        </w:rPr>
+        <w:t xml:space="preserve">• Integrated enterprise toolchains (Figma, GitHub, Atlassian, Google Workspace) via Model Context Protocol (MCP) servers and plugins; standardized agent context via AGENTS.md and reusable skill lifecycles.</w:t>
+      </w:r>
+    </w:p>
+    <w:p>
+      <w:pPr>
+        <w:spacing w:before="0" w:after="20" w:line="240" w:lineRule="auto"/>
+        <w:ind w:left="360" w:hanging="180"/>
+      </w:pPr>
+      <w:r>
+        <w:rPr>
+          <w:color w:val="1F1F1F"/>
+          <w:sz w:val="18"/>
+        </w:rPr>
+        <w:t xml:space="preserve">• Formulated enterprise prompting methodologies (Outcome, Constraints, Definition of Done) and evidence-based verification gates replacing agent self-assessment with deterministic testing.</w:t>
+      </w:r>
+    </w:p>
+    <w:p>
+      <w:pPr>
+        <w:spacing w:before="0" w:after="20" w:line="240" w:lineRule="auto"/>
+        <w:ind w:left="360" w:hanging="180"/>
+      </w:pPr>
+      <w:r>
+        <w:rPr>
+          <w:color w:val="1F1F1F"/>
+          <w:sz w:val="18"/>
+        </w:rPr>
+        <w:t xml:space="preserve">• Designed AI transformation toolkits, AI maturity assessments, use-case prioritization canvases, and governance guardrails based on NIST AI RMF 1.0 and ISO 42001.</w:t>
       </w:r>
     </w:p>
     <w:p>
@@ -744,6 +770,26 @@
           <w:color w:val="17365D"/>
           <w:sz w:val="18"/>
         </w:rPr>
+        <w:t xml:space="preserve">OpenAI Codex Bootcamps: </w:t>
+      </w:r>
+      <w:r>
+        <w:rPr>
+          <w:color w:val="1F1F1F"/>
+          <w:sz w:val="18"/>
+        </w:rPr>
+        <w:t xml:space="preserve">Completed 7 Bootcamps across Fundamentals, 201, and 301 (Agent Orchestration, MCP Integration, Context Engineering)</w:t>
+      </w:r>
+    </w:p>
+    <w:p>
+      <w:pPr>
+        <w:spacing w:before="0" w:after="15" w:line="240" w:lineRule="auto"/>
+      </w:pPr>
+      <w:r>
+        <w:rPr>
+          <w:b/>
+          <w:color w:val="17365D"/>
+          <w:sz w:val="18"/>
+        </w:rPr>
         <w:t xml:space="preserve">UC Berkeley Extension: </w:t>
       </w:r>
       <w:r>
@@ -988,7 +1034,7 @@
           <w:color w:val="1F1F1F"/>
           <w:sz w:val="18"/>
         </w:rPr>
-        <w:t xml:space="preserve">Agentic AI Workflows • Retrieval-Augmented Generation • LLM Evaluation &amp; Observability • Context Management • AI Governance &amp; Responsible AI • NIST AI RMF 1.0 • Semantic Modeling &amp; Ontology Design • Qdrant Vector Search • Codex, Antigravity, Cursor, OpenAI</w:t>
+        <w:t xml:space="preserve">Agentic AI Workflows • Multi-Agent Orchestration • Model Context Protocol (MCP) • OpenAI Codex (CLI, IDE, App) • Google Antigravity • Context Engineering (AGENTS.md) • Retrieval-Augmented Generation • LLM Evaluation &amp; Observability • AI Governance &amp; Responsible AI • NIST AI RMF 1.0 • ISO 42001 • Bounded Execution Guardrails • Prompt Engineering Frameworks • Qdrant Vector Search • Codex, Antigravity, Cursor, OpenAI</w:t>
       </w:r>
     </w:p>
     <w:sectPr>

</xml_diff>

<commit_message>
feat: integrate AI Trading Copilot as-built technical design into master resume, skills, and certifications repository
</commit_message>
<xml_diff>
--- a/output/Bulleted_Standard/Ebenezer_Rolston_Bulleted_Standard_Resume.docx
+++ b/output/Bulleted_Standard/Ebenezer_Rolston_Bulleted_Standard_Resume.docx
@@ -174,7 +174,7 @@
           <w:color w:val="1F1F1F"/>
           <w:sz w:val="17"/>
         </w:rPr>
-        <w:t xml:space="preserve">▪ Customer Data Integration &amp; Entity Resolution ▪ Identity Scoring Models &amp; Algorithmic Scoring ▪ Identity Data Quality, Profiling &amp; Hygiene ▪ Identity Match Reach &amp; Quality KPIs ▪ Agentic AI Harness Engineering ▪ State Machine &amp; Multi-Agent Architecture ▪ Model Context Protocol Integration ▪ Trajectory Observability &amp; Evaluation ▪ Relational Schema Design ▪ Advanced SQL ▪ Privacy, Regulatory &amp; AI Governance ▪ Python Data Analysis ▪ Enterprise ETL Architecture &amp; Conversion ▪ Automated Validation &amp; Testing ▪ Cross-Functional Stakeholder Relationship ▪ User Enablement &amp; Mentorship</w:t>
+        <w:t xml:space="preserve">▪ Customer Data Integration &amp; Entity Resolution ▪ Identity Scoring Models &amp; Algorithmic Scoring ▪ Identity Data Quality, Profiling &amp; Hygiene ▪ Identity Match Reach &amp; Quality KPIs ▪ Agentic AI Harness Engineering ▪ State Machine &amp; Multi-Agent Architecture ▪ Non-Bypassable RiskGate &amp; Fail-Closed Guardrails ▪ Model Context Protocol Integration ▪ Trajectory Observability &amp; Evaluation ▪ Relational Schema Design ▪ Advanced SQL ▪ Privacy, Regulatory &amp; AI Governance ▪ Python Data Analysis ▪ Enterprise ETL Architecture &amp; Conversion ▪ Automated Validation &amp; Testing ▪ Cross-Functional Stakeholder Relationship ▪ User Enablement &amp; Mentorship</w:t>
       </w:r>
     </w:p>
     <w:p>
@@ -232,7 +232,87 @@
           <w:color w:val="1F1F1F"/>
           <w:sz w:val="18"/>
         </w:rPr>
-        <w:t xml:space="preserve">Engineered autonomous multi-agent workflows and custom TOML/markdown agents using OpenAI Codex and Google Antigravity with runtime hooks, Plan Mode trade-off analysis, and automated build–test–fix loops.</w:t>
+        <w:t xml:space="preserve">Architected and deployed the AI Trading Copilot decision-support platform, featuring private Google Cloud Run FastAPI microservices, private Cloud SQL PostgreSQL 15 with 21 domain tables, Alembic migrations, Secret Manager, and VPC networking.</w:t>
+      </w:r>
+    </w:p>
+    <w:p>
+      <w:pPr>
+        <w:spacing w:before="0" w:after="20" w:line="240" w:lineRule="auto"/>
+        <w:ind w:left="360" w:hanging="180"/>
+      </w:pPr>
+      <w:r>
+        <w:rPr>
+          <w:color w:val="1F1F1F"/>
+          <w:sz w:val="20"/>
+        </w:rPr>
+        <w:t xml:space="preserve">• </w:t>
+      </w:r>
+      <w:r>
+        <w:rPr>
+          <w:color w:val="1F1F1F"/>
+          <w:sz w:val="18"/>
+        </w:rPr>
+        <w:t xml:space="preserve">Built a 5-agent LangGraph supervisor system with specialist agents for chart range, levels, fundamentals with SEC EDGAR XBRL, news catalysts, and thesis scenarios utilizing typed Pydantic v2 contracts.</w:t>
+      </w:r>
+    </w:p>
+    <w:p>
+      <w:pPr>
+        <w:spacing w:before="0" w:after="20" w:line="240" w:lineRule="auto"/>
+        <w:ind w:left="360" w:hanging="180"/>
+      </w:pPr>
+      <w:r>
+        <w:rPr>
+          <w:color w:val="1F1F1F"/>
+          <w:sz w:val="20"/>
+        </w:rPr>
+        <w:t xml:space="preserve">• </w:t>
+      </w:r>
+      <w:r>
+        <w:rPr>
+          <w:color w:val="1F1F1F"/>
+          <w:sz w:val="18"/>
+        </w:rPr>
+        <w:t xml:space="preserve">Implemented a deterministic fail-closed RiskGate emitting PASS, WARN, or BLOCK, preventing recommendation generation and blocking human approvals on integrity breaches.</w:t>
+      </w:r>
+    </w:p>
+    <w:p>
+      <w:pPr>
+        <w:spacing w:before="0" w:after="20" w:line="240" w:lineRule="auto"/>
+        <w:ind w:left="360" w:hanging="180"/>
+      </w:pPr>
+      <w:r>
+        <w:rPr>
+          <w:color w:val="1F1F1F"/>
+          <w:sz w:val="20"/>
+        </w:rPr>
+        <w:t xml:space="preserve">• </w:t>
+      </w:r>
+      <w:r>
+        <w:rPr>
+          <w:color w:val="1F1F1F"/>
+          <w:sz w:val="18"/>
+        </w:rPr>
+        <w:t xml:space="preserve">Engineered machine-verifiable EvidenceLedger tracking citations by evidence ID, source provider, content hash, and fixed as-of timestamps to eliminate lookahead bias.</w:t>
+      </w:r>
+    </w:p>
+    <w:p>
+      <w:pPr>
+        <w:spacing w:before="0" w:after="20" w:line="240" w:lineRule="auto"/>
+        <w:ind w:left="360" w:hanging="180"/>
+      </w:pPr>
+      <w:r>
+        <w:rPr>
+          <w:color w:val="1F1F1F"/>
+          <w:sz w:val="20"/>
+        </w:rPr>
+        <w:t xml:space="preserve">• </w:t>
+      </w:r>
+      <w:r>
+        <w:rPr>
+          <w:color w:val="1F1F1F"/>
+          <w:sz w:val="18"/>
+        </w:rPr>
+        <w:t xml:space="preserve">Engineered autonomous multi-agent workflows and custom TOML and markdown agents using OpenAI Codex and Google Antigravity with runtime hooks, Plan Mode trade-off analysis, and automated build–test–fix loops.</w:t>
       </w:r>
     </w:p>
     <w:p>
@@ -732,87 +812,107 @@
           <w:color w:val="4A4A4A"/>
           <w:sz w:val="17"/>
         </w:rPr>
-        <w:t xml:space="preserve">AI in Finance Nicole Koenigstein</w:t>
-      </w:r>
-    </w:p>
-    <w:p>
-      <w:pPr>
-        <w:spacing w:before="0" w:after="20" w:line="240" w:lineRule="auto"/>
-        <w:ind w:left="360" w:hanging="180"/>
-      </w:pPr>
-      <w:r>
-        <w:rPr>
-          <w:color w:val="1F1F1F"/>
-          <w:sz w:val="20"/>
-        </w:rPr>
-        <w:t xml:space="preserve">• </w:t>
-      </w:r>
-      <w:r>
-        <w:rPr>
-          <w:color w:val="1F1F1F"/>
-          <w:sz w:val="18"/>
-        </w:rPr>
-        <w:t xml:space="preserve">Architected multi-agent equities research pipelines in LangGraph combining hierarchical supervisor and peer-to-peer topologies with bounded execution budgets and deterministic state machine transitions.</w:t>
-      </w:r>
-    </w:p>
-    <w:p>
-      <w:pPr>
-        <w:spacing w:before="0" w:after="20" w:line="240" w:lineRule="auto"/>
-        <w:ind w:left="360" w:hanging="180"/>
-      </w:pPr>
-      <w:r>
-        <w:rPr>
-          <w:color w:val="1F1F1F"/>
-          <w:sz w:val="20"/>
-        </w:rPr>
-        <w:t xml:space="preserve">• </w:t>
-      </w:r>
-      <w:r>
-        <w:rPr>
-          <w:color w:val="1F1F1F"/>
-          <w:sz w:val="18"/>
-        </w:rPr>
-        <w:t xml:space="preserve">Implemented 4-layer harness architecture separating non-deterministic model proposals from deterministic policy enforcement, tool contracts, and zero-trust sandbox execution.</w:t>
-      </w:r>
-    </w:p>
-    <w:p>
-      <w:pPr>
-        <w:spacing w:before="0" w:after="20" w:line="240" w:lineRule="auto"/>
-        <w:ind w:left="360" w:hanging="180"/>
-      </w:pPr>
-      <w:r>
-        <w:rPr>
-          <w:color w:val="1F1F1F"/>
-          <w:sz w:val="20"/>
-        </w:rPr>
-        <w:t xml:space="preserve">• </w:t>
-      </w:r>
-      <w:r>
-        <w:rPr>
-          <w:color w:val="1F1F1F"/>
-          <w:sz w:val="18"/>
-        </w:rPr>
-        <w:t xml:space="preserve">Integrated 6-measure trajectory observability covering Correctness, Grounding, Latency p95, Cost, Safety, and Auditability via OpenTelemetry and self-hosted Langfuse to audit multi-step reasoning paths.</w:t>
-      </w:r>
-    </w:p>
-    <w:p>
-      <w:pPr>
-        <w:spacing w:before="0" w:after="20" w:line="240" w:lineRule="auto"/>
-        <w:ind w:left="360" w:hanging="180"/>
-      </w:pPr>
-      <w:r>
-        <w:rPr>
-          <w:color w:val="1F1F1F"/>
-          <w:sz w:val="20"/>
-        </w:rPr>
-        <w:t xml:space="preserve">• </w:t>
-      </w:r>
-      <w:r>
-        <w:rPr>
-          <w:color w:val="1F1F1F"/>
-          <w:sz w:val="18"/>
-        </w:rPr>
-        <w:t xml:space="preserve">Engineered multimodal financial parsing for SEC filings and earnings calls, combining tabular footing reconciliation, audio speaker diarization, and foundation time-series forecasting with calibrated predictive quantile distributions.</w:t>
+        <w:t xml:space="preserve">AI Guardians LLC • As-Built Production Architecture</w:t>
+      </w:r>
+    </w:p>
+    <w:p>
+      <w:pPr>
+        <w:spacing w:before="0" w:after="20" w:line="240" w:lineRule="auto"/>
+        <w:ind w:left="360" w:hanging="180"/>
+      </w:pPr>
+      <w:r>
+        <w:rPr>
+          <w:color w:val="1F1F1F"/>
+          <w:sz w:val="20"/>
+        </w:rPr>
+        <w:t xml:space="preserve">• </w:t>
+      </w:r>
+      <w:r>
+        <w:rPr>
+          <w:color w:val="1F1F1F"/>
+          <w:sz w:val="18"/>
+        </w:rPr>
+        <w:t xml:space="preserve">Architected multi-horizon U.S. equities decision-support platform deployed on private Google Cloud Run FastAPI microservice trading-copilot-api and private Cloud SQL PostgreSQL 15 with 21 domain tables and Alembic migrations.</w:t>
+      </w:r>
+    </w:p>
+    <w:p>
+      <w:pPr>
+        <w:spacing w:before="0" w:after="20" w:line="240" w:lineRule="auto"/>
+        <w:ind w:left="360" w:hanging="180"/>
+      </w:pPr>
+      <w:r>
+        <w:rPr>
+          <w:color w:val="1F1F1F"/>
+          <w:sz w:val="20"/>
+        </w:rPr>
+        <w:t xml:space="preserve">• </w:t>
+      </w:r>
+      <w:r>
+        <w:rPr>
+          <w:color w:val="1F1F1F"/>
+          <w:sz w:val="18"/>
+        </w:rPr>
+        <w:t xml:space="preserve">Engineered 5 specialist agents — ChartRange, Levels, Fundamentals with SEC EDGAR XBRL, News Catalyst, and Thesis Scenario — orchestrated via LangGraph supervisor with typed Pydantic v2 contracts.</w:t>
+      </w:r>
+    </w:p>
+    <w:p>
+      <w:pPr>
+        <w:spacing w:before="0" w:after="20" w:line="240" w:lineRule="auto"/>
+        <w:ind w:left="360" w:hanging="180"/>
+      </w:pPr>
+      <w:r>
+        <w:rPr>
+          <w:color w:val="1F1F1F"/>
+          <w:sz w:val="20"/>
+        </w:rPr>
+        <w:t xml:space="preserve">• </w:t>
+      </w:r>
+      <w:r>
+        <w:rPr>
+          <w:color w:val="1F1F1F"/>
+          <w:sz w:val="18"/>
+        </w:rPr>
+        <w:t xml:space="preserve">Enforced strict separation between deterministic calculation — RSI, ATR, moving averages, pivots, financial ratios, MFE and MAE in Python — and LLM structured interpretation, backed by a non-bypassable fail-closed RiskGate emitting PASS, WARN, or BLOCK.</w:t>
+      </w:r>
+    </w:p>
+    <w:p>
+      <w:pPr>
+        <w:spacing w:before="0" w:after="20" w:line="240" w:lineRule="auto"/>
+        <w:ind w:left="360" w:hanging="180"/>
+      </w:pPr>
+      <w:r>
+        <w:rPr>
+          <w:color w:val="1F1F1F"/>
+          <w:sz w:val="20"/>
+        </w:rPr>
+        <w:t xml:space="preserve">• </w:t>
+      </w:r>
+      <w:r>
+        <w:rPr>
+          <w:color w:val="1F1F1F"/>
+          <w:sz w:val="18"/>
+        </w:rPr>
+        <w:t xml:space="preserve">Built machine-verifiable EvidenceLedger tracking citations by evidence ID, source provider, content hash, and fixed point-in-time as-of boundaries to guarantee anti-lookahead temporal integrity.</w:t>
+      </w:r>
+    </w:p>
+    <w:p>
+      <w:pPr>
+        <w:spacing w:before="0" w:after="20" w:line="240" w:lineRule="auto"/>
+        <w:ind w:left="360" w:hanging="180"/>
+      </w:pPr>
+      <w:r>
+        <w:rPr>
+          <w:color w:val="1F1F1F"/>
+          <w:sz w:val="20"/>
+        </w:rPr>
+        <w:t xml:space="preserve">• </w:t>
+      </w:r>
+      <w:r>
+        <w:rPr>
+          <w:color w:val="1F1F1F"/>
+          <w:sz w:val="18"/>
+        </w:rPr>
+        <w:t xml:space="preserve">Established immutable Prediction Ledger separating forecast-time PredictionRecord from post-run PredictionOutcome, validated across 722 automated tests with zero network leaks.</w:t>
       </w:r>
     </w:p>
     <w:p>
@@ -1297,7 +1397,7 @@
           <w:color w:val="1F1F1F"/>
           <w:sz w:val="18"/>
         </w:rPr>
-        <w:t xml:space="preserve"> Acxiom Hive, AbiliTec Links, Apache Spark • Oracle, PostgreSQL, SQL Server • ETL/ELT Architectures • Relational Data Modeling • Schema Normalization • Data Quality, Deduplication &amp; Profiling</w:t>
+        <w:t xml:space="preserve"> Acxiom Hive, AbiliTec Links, Apache Spark • Oracle, PostgreSQL 15 on Cloud SQL, SQL Server • Alembic Migrations • 21 Domain Tables • ETL/ELT Architectures • Relational Data Modeling • Schema Normalization • Data Quality, Deduplication &amp; Profiling</w:t>
       </w:r>
     </w:p>
     <w:p>
@@ -1325,7 +1425,7 @@
           <w:color w:val="1F1F1F"/>
           <w:sz w:val="18"/>
         </w:rPr>
-        <w:t xml:space="preserve"> Python • pandas &amp; NumPy • FastAPI • Pydantic • SQLAlchemy • RESTful API Contracts • JSON Schema • pytest • GitHub • Cloud Deployment on Google Cloud Run and Vercel</w:t>
+        <w:t xml:space="preserve"> Python • pandas &amp; NumPy • FastAPI &amp; Uvicorn • OpenAPI 3.1 • Pydantic v2 • SQLAlchemy • RESTful API Contracts • JSON Schema • pytest • GitHub • Cloud Deployment on Private Google Cloud Run, Cloud SQL, Secret Manager, VPC Peering, and Vercel</w:t>
       </w:r>
     </w:p>
     <w:p>
@@ -1353,7 +1453,7 @@
           <w:color w:val="1F1F1F"/>
           <w:sz w:val="18"/>
         </w:rPr>
-        <w:t xml:space="preserve"> SAP S/4HANA Federal Business Management System • Unison PRISM • Remedy</w:t>
+        <w:t xml:space="preserve"> SAP S/4HANA Federal Business Management System • Unison PRISM • Remedy • Multi-Tenant SafeReusePolicy • 5-Tier Data Isolation • NIST AI RMF 1.0 • ISO 42001</w:t>
       </w:r>
     </w:p>
     <w:p>
@@ -1381,7 +1481,7 @@
           <w:color w:val="1F1F1F"/>
           <w:sz w:val="18"/>
         </w:rPr>
-        <w:t xml:space="preserve"> Agentic Harness Engineering • LangGraph StateGraph FSM and HSM • Multi-Agent Topologies — Hierarchical, Peer-to-Peer, Blackboard, Swarm • Model Context Protocol MCP • OpenAI Codex CLI, IDE, Desktop App • Google Antigravity • Context Engineering with AGENTS.md • Trajectory Observability &amp; Tracing via OpenTelemetry, Langfuse, LangSmith • Policy Optimization via GRPO, GSPO, RULER • Sandboxing &amp; Security with Docker, E2B, OWASP Top 15 Agent Vulnerabilities • Financial Multimodal RAG &amp; Table Footing Verification • Foundation Time-Series Models — Chronos, TimesFM, PatchTST, AnomalyBERT • Inference Physics with vLLM PagedAttention and SGLang RadixAttention • Structured Output Modes — Strict JSON Schema, Instructor Pydantic • AI Governance &amp; Responsible AI • NIST AI RMF 1.0 • ISO 42001 • Bounded Execution Guardrails • Qdrant Vector Search</w:t>
+        <w:t xml:space="preserve"> Agentic Harness Engineering • LangGraph StateGraph FSM and HSM • Non-Bypassable RiskGate • Fail-Closed Architecture • EvidenceLedger Provenance Tracking • Anti-Lookahead Temporal Integrity • Prediction Ledger with PredictionRecord and PredictionOutcome • MFE and MAE Tracking • ModelRouter &amp; BaseLLMProvider • FinBERT Financial Sentiment Classification • Multi-Agent Topologies — Hierarchical, Peer-to-Peer, Blackboard, Swarm • Model Context Protocol MCP • OpenAI Codex CLI, IDE, Desktop App • Google Antigravity • Context Engineering with AGENTS.md • Trajectory Observability &amp; Tracing via OpenTelemetry, Langfuse, LangSmith • Policy Optimization via GRPO, GSPO, RULER • Sandboxing &amp; Security with Docker, E2B, OWASP Top 15 Agent Vulnerabilities • Financial Multimodal RAG &amp; Table Footing Verification • Foundation Time-Series Models — Chronos, TimesFM, PatchTST, AnomalyBERT • Inference Physics with vLLM PagedAttention and SGLang RadixAttention • Structured Output Modes — Strict JSON Schema, Instructor Pydantic • Bounded Execution Guardrails • Qdrant Vector Search</w:t>
       </w:r>
     </w:p>
     <w:sectPr>

</xml_diff>